<commit_message>
Verify TIABD practice 7 in Colab and update report
</commit_message>
<xml_diff>
--- a/4/BD/ТИАБД_ПР7_АлбахтинИВ.docx
+++ b/4/BD/ТИАБД_ПР7_АлбахтинИВ.docx
@@ -47,7 +47,7 @@
                 <w14:ligatures w14:val="none"/>
               </w:rPr>
               <w:drawing>
-                <wp:inline distT="0" distB="0" distL="0" distR="0" wp14:anchorId="1B4FF192" wp14:editId="64F330F3">
+                <wp:inline distT="0" distB="0" distL="0" distR="0" wp14:anchorId="766B2DCD" wp14:editId="08C8F654">
                   <wp:extent cx="1066800" cy="1066800"/>
                   <wp:effectExtent l="0" t="0" r="0" b="0"/>
                   <wp:docPr id="298370851" name="Рисунок 3"/>
@@ -244,7 +244,7 @@
               <mc:AlternateContent>
                 <mc:Choice Requires="wps">
                   <w:drawing>
-                    <wp:inline distT="0" distB="0" distL="0" distR="0" wp14:anchorId="60A9BBFB" wp14:editId="6A9D86FD">
+                    <wp:inline distT="0" distB="0" distL="0" distR="0" wp14:anchorId="209EBAE0" wp14:editId="0473EC5C">
                       <wp:extent cx="5600700" cy="1270"/>
                       <wp:effectExtent l="19050" t="19050" r="19050" b="27305"/>
                       <wp:docPr id="2" name="Прямая соединительная линия 2"/>
@@ -919,7 +919,7 @@
       <w:r>
         <w:fldChar w:fldCharType="separate"/>
       </w:r>
-      <w:hyperlink w:anchor="_Toc243867942" w:history="1">
+      <w:hyperlink w:anchor="_Toc243869330" w:history="1">
         <w:r>
           <w:rPr>
             <w:rStyle w:val="a4"/>
@@ -948,7 +948,7 @@
             <w:noProof/>
             <w:webHidden/>
           </w:rPr>
-          <w:instrText xml:space="preserve"> PAGEREF _Toc243867942 \h </w:instrText>
+          <w:instrText xml:space="preserve"> PAGEREF _Toc243869330 \h </w:instrText>
         </w:r>
         <w:r>
           <w:rPr>
@@ -994,7 +994,7 @@
           <w14:ligatures w14:val="none"/>
         </w:rPr>
       </w:pPr>
-      <w:hyperlink w:anchor="_Toc243867943" w:history="1">
+      <w:hyperlink w:anchor="_Toc243869331" w:history="1">
         <w:r>
           <w:rPr>
             <w:rStyle w:val="a4"/>
@@ -1023,7 +1023,7 @@
             <w:noProof/>
             <w:webHidden/>
           </w:rPr>
-          <w:instrText xml:space="preserve"> PAGEREF _Toc243867943 \h </w:instrText>
+          <w:instrText xml:space="preserve"> PAGEREF _Toc243869331 \h </w:instrText>
         </w:r>
         <w:r>
           <w:rPr>
@@ -1069,7 +1069,7 @@
           <w14:ligatures w14:val="none"/>
         </w:rPr>
       </w:pPr>
-      <w:hyperlink w:anchor="_Toc243867944" w:history="1">
+      <w:hyperlink w:anchor="_Toc243869332" w:history="1">
         <w:r>
           <w:rPr>
             <w:rStyle w:val="a4"/>
@@ -1098,7 +1098,7 @@
             <w:noProof/>
             <w:webHidden/>
           </w:rPr>
-          <w:instrText xml:space="preserve"> PAGEREF _Toc243867944 \h </w:instrText>
+          <w:instrText xml:space="preserve"> PAGEREF _Toc243869332 \h </w:instrText>
         </w:r>
         <w:r>
           <w:rPr>
@@ -1144,7 +1144,7 @@
           <w14:ligatures w14:val="none"/>
         </w:rPr>
       </w:pPr>
-      <w:hyperlink w:anchor="_Toc243867945" w:history="1">
+      <w:hyperlink w:anchor="_Toc243869333" w:history="1">
         <w:r>
           <w:rPr>
             <w:rStyle w:val="a4"/>
@@ -1173,7 +1173,7 @@
             <w:noProof/>
             <w:webHidden/>
           </w:rPr>
-          <w:instrText xml:space="preserve"> PAGEREF _Toc243867945 \h </w:instrText>
+          <w:instrText xml:space="preserve"> PAGEREF _Toc243869333 \h </w:instrText>
         </w:r>
         <w:r>
           <w:rPr>
@@ -1219,7 +1219,7 @@
           <w14:ligatures w14:val="none"/>
         </w:rPr>
       </w:pPr>
-      <w:hyperlink w:anchor="_Toc243867946" w:history="1">
+      <w:hyperlink w:anchor="_Toc243869334" w:history="1">
         <w:r>
           <w:rPr>
             <w:rStyle w:val="a4"/>
@@ -1248,7 +1248,7 @@
             <w:noProof/>
             <w:webHidden/>
           </w:rPr>
-          <w:instrText xml:space="preserve"> PAGEREF _Toc243867946 \h </w:instrText>
+          <w:instrText xml:space="preserve"> PAGEREF _Toc243869334 \h </w:instrText>
         </w:r>
         <w:r>
           <w:rPr>
@@ -1294,7 +1294,7 @@
           <w14:ligatures w14:val="none"/>
         </w:rPr>
       </w:pPr>
-      <w:hyperlink w:anchor="_Toc243867947" w:history="1">
+      <w:hyperlink w:anchor="_Toc243869335" w:history="1">
         <w:r>
           <w:rPr>
             <w:rStyle w:val="a4"/>
@@ -1323,7 +1323,7 @@
             <w:noProof/>
             <w:webHidden/>
           </w:rPr>
-          <w:instrText xml:space="preserve"> PAGEREF _Toc243867947 \h </w:instrText>
+          <w:instrText xml:space="preserve"> PAGEREF _Toc243869335 \h </w:instrText>
         </w:r>
         <w:r>
           <w:rPr>
@@ -1369,7 +1369,7 @@
           <w14:ligatures w14:val="none"/>
         </w:rPr>
       </w:pPr>
-      <w:hyperlink w:anchor="_Toc243867948" w:history="1">
+      <w:hyperlink w:anchor="_Toc243869336" w:history="1">
         <w:r>
           <w:rPr>
             <w:rStyle w:val="a4"/>
@@ -1377,7 +1377,7 @@
             <w:color w:val="000000"/>
             <w:u w:val="none"/>
           </w:rPr>
-          <w:t>7 Сохранение и выводы</w:t>
+          <w:t>7 Полный запуск в Google Colab</w:t>
         </w:r>
         <w:r>
           <w:rPr>
@@ -1398,7 +1398,7 @@
             <w:noProof/>
             <w:webHidden/>
           </w:rPr>
-          <w:instrText xml:space="preserve"> PAGEREF _Toc243867948 \h </w:instrText>
+          <w:instrText xml:space="preserve"> PAGEREF _Toc243869336 \h </w:instrText>
         </w:r>
         <w:r>
           <w:rPr>
@@ -1444,7 +1444,7 @@
           <w14:ligatures w14:val="none"/>
         </w:rPr>
       </w:pPr>
-      <w:hyperlink w:anchor="_Toc243867949" w:history="1">
+      <w:hyperlink w:anchor="_Toc243869337" w:history="1">
         <w:r>
           <w:rPr>
             <w:rStyle w:val="a4"/>
@@ -1452,6 +1452,81 @@
             <w:color w:val="000000"/>
             <w:u w:val="none"/>
           </w:rPr>
+          <w:t>8 Сохранение и выводы</w:t>
+        </w:r>
+        <w:r>
+          <w:rPr>
+            <w:noProof/>
+            <w:webHidden/>
+          </w:rPr>
+          <w:tab/>
+        </w:r>
+        <w:r>
+          <w:rPr>
+            <w:noProof/>
+            <w:webHidden/>
+          </w:rPr>
+          <w:fldChar w:fldCharType="begin"/>
+        </w:r>
+        <w:r>
+          <w:rPr>
+            <w:noProof/>
+            <w:webHidden/>
+          </w:rPr>
+          <w:instrText xml:space="preserve"> PAGEREF _Toc243869337 \h </w:instrText>
+        </w:r>
+        <w:r>
+          <w:rPr>
+            <w:noProof/>
+            <w:webHidden/>
+          </w:rPr>
+        </w:r>
+        <w:r>
+          <w:rPr>
+            <w:noProof/>
+            <w:webHidden/>
+          </w:rPr>
+          <w:fldChar w:fldCharType="separate"/>
+        </w:r>
+        <w:r>
+          <w:rPr>
+            <w:noProof/>
+            <w:webHidden/>
+          </w:rPr>
+          <w:t>9</w:t>
+        </w:r>
+        <w:r>
+          <w:rPr>
+            <w:noProof/>
+            <w:webHidden/>
+          </w:rPr>
+          <w:fldChar w:fldCharType="end"/>
+        </w:r>
+      </w:hyperlink>
+    </w:p>
+    <w:p>
+      <w:pPr>
+        <w:pStyle w:val="12"/>
+        <w:tabs>
+          <w:tab w:val="right" w:leader="dot" w:pos="9345"/>
+        </w:tabs>
+        <w:spacing w:after="60" w:line="240" w:lineRule="auto"/>
+        <w:rPr>
+          <w:rFonts w:eastAsiaTheme="minorEastAsia"/>
+          <w:noProof/>
+          <w:kern w:val="0"/>
+          <w:szCs w:val="22"/>
+          <w14:ligatures w14:val="none"/>
+        </w:rPr>
+      </w:pPr>
+      <w:hyperlink w:anchor="_Toc243869338" w:history="1">
+        <w:r>
+          <w:rPr>
+            <w:rStyle w:val="a4"/>
+            <w:noProof/>
+            <w:color w:val="000000"/>
+            <w:u w:val="none"/>
+          </w:rPr>
           <w:t>Источники</w:t>
         </w:r>
         <w:r>
@@ -1473,7 +1548,7 @@
             <w:noProof/>
             <w:webHidden/>
           </w:rPr>
-          <w:instrText xml:space="preserve"> PAGEREF _Toc243867949 \h </w:instrText>
+          <w:instrText xml:space="preserve"> PAGEREF _Toc243869338 \h </w:instrText>
         </w:r>
         <w:r>
           <w:rPr>
@@ -1493,7 +1568,7 @@
             <w:noProof/>
             <w:webHidden/>
           </w:rPr>
-          <w:t>8</w:t>
+          <w:t>10</w:t>
         </w:r>
         <w:r>
           <w:rPr>
@@ -1519,7 +1594,7 @@
         <w:pStyle w:val="1"/>
         <w:pageBreakBefore/>
       </w:pPr>
-      <w:bookmarkStart w:id="0" w:name="_Toc243867942"/>
+      <w:bookmarkStart w:id="0" w:name="_Toc243869330"/>
       <w:r>
         <w:lastRenderedPageBreak/>
         <w:t xml:space="preserve">1 Цель и </w:t>
@@ -1555,7 +1630,7 @@
       <w:pPr>
         <w:pStyle w:val="1"/>
       </w:pPr>
-      <w:bookmarkStart w:id="1" w:name="_Toc243867943"/>
+      <w:bookmarkStart w:id="1" w:name="_Toc243869331"/>
       <w:r>
         <w:t>2 Среда и данные</w:t>
       </w:r>
@@ -1824,10 +1899,10 @@
         <w:pStyle w:val="ReportBody"/>
       </w:pPr>
       <w:r>
-        <w:t xml:space="preserve">Измерения этого отчёта получены в </w:t>
-      </w:r>
-      <w:r>
-        <w:t>указанной VM. Методичка предусматривает ColabNotebook: подготовленный .ipynb совместим с Colab, где исходный CSV следует загрузить в data/ либо рабочий каталог. Запуск VM подтверждён протоколом; результаты не выдаются за замеры облачного CPU или GPU.</w:t>
+        <w:t xml:space="preserve">В разделах 2–6 приведены замеры учебной VM. </w:t>
+      </w:r>
+      <w:r>
+        <w:t>Требование ColabNotebook выполнено отдельным полным запуском тех же пяти расчётных ячеек в новой CPU-среде Google Colab. Окружение, результаты и время облачного запуска приведены в разделе 7; времена разных стендов сохранены отдельно.</w:t>
       </w:r>
     </w:p>
     <w:p>
@@ -1835,13 +1910,13 @@
         <w:pStyle w:val="ReportBody"/>
       </w:pPr>
       <w:r>
-        <w:t>Набор</w:t>
-      </w:r>
-      <w:r>
-        <w:t xml:space="preserve"> предоставлен пользователем в Podcast Dataset.zip. Цель измеряется в минутах. Используются Episode_Length_minutes, Host_Popularity_percentage, Guest_Popularity_percentage, Number_of_Ads и категории Genre, Publication_Day, Publication_Time, Episode_Sentimen</w:t>
-      </w:r>
-      <w:r>
-        <w:t xml:space="preserve">t. Сценарий предполагает, что контентные метаданные известны к публикации. </w:t>
+        <w:t>Набор предоставлен по</w:t>
+      </w:r>
+      <w:r>
+        <w:t>льзователем в Podcast Dataset.zip. Цель измеряется в минутах. Используются Episode_Length_minutes, Host_Popularity_percentage, Guest_Popularity_percentage, Number_of_Ads и категории Genre, Publication_Day, Publication_Time, Episode_Sentiment. Сценарий пред</w:t>
+      </w:r>
+      <w:r>
+        <w:t xml:space="preserve">полагает, что контентные метаданные известны к публикации. </w:t>
       </w:r>
       <w:r>
         <w:lastRenderedPageBreak/>
@@ -1954,7 +2029,10 @@
               <w:jc w:val="center"/>
             </w:pPr>
             <w:r>
-              <w:t>52 500</w:t>
+              <w:t xml:space="preserve">52 </w:t>
+            </w:r>
+            <w:r>
+              <w:t>500</w:t>
             </w:r>
           </w:p>
         </w:tc>
@@ -2140,20 +2218,20 @@
         <w:pStyle w:val="ReportBody"/>
       </w:pPr>
       <w:r>
-        <w:t>В исходном файле пропущено 5 395 значений цели, 5 246 длин эпизода и 5 258 значений поп</w:t>
-      </w:r>
-      <w:r>
-        <w:t>улярности гостя. После удаления точных копий остаётся 5 132 строки без цели; их исключают, не заполняя ответы. Числовые предикторы заполняются медианами только train. Одинаковая пара Podcast_Name/Episode_Title имеет разные длины и не считается надёжным иде</w:t>
-      </w:r>
-      <w:r>
-        <w:t>нтификатором наблюдения.</w:t>
+        <w:t>В исходном файле пропущено 5 395 значений цели, 5 246 длин эпизода и 5 258 значений популярности гостя. По</w:t>
+      </w:r>
+      <w:r>
+        <w:t>сле удаления точных копий остаётся 5 132 строки без цели; их исключают, не заполняя ответы. Числовые предикторы заполняются медианами только train. Одинаковая пара Podcast_Name/Episode_Title имеет разные длины и не считается надёжным идентификатором наблюд</w:t>
+      </w:r>
+      <w:r>
+        <w:t>ения.</w:t>
       </w:r>
     </w:p>
     <w:p>
       <w:pPr>
         <w:pStyle w:val="1"/>
       </w:pPr>
-      <w:bookmarkStart w:id="2" w:name="_Toc243867944"/>
+      <w:bookmarkStart w:id="2" w:name="_Toc243869332"/>
       <w:r>
         <w:t>3 Разбиение без пересечения подкастов</w:t>
       </w:r>
@@ -2164,10 +2242,10 @@
         <w:pStyle w:val="ReportBody"/>
       </w:pPr>
       <w:r>
-        <w:t>GroupShuffleSplit с random_state=42 сначала выделяет 20% групп для test, затем 25% оставшихся групп для valid. Целые Podcast_Name попадают только в одну часть. Это проверяет перенос на новые по</w:t>
-      </w:r>
-      <w:r>
-        <w:t>дкасты. Podcast_Name и Episode_Title исключены из предикторов; они не становятся признаками скрытого запоминания. Временное разбиение невозможно обосновать по названию дня недели без календарной даты.</w:t>
+        <w:t>GroupShuffleSplit с random_state=42 сначала выделяет 20% групп для test, затем 25% оставшихся групп для valid. Целые Podcast_Name попадают только в одну часть. Это проверяет перенос на новые подкасты. Podcast_Nam</w:t>
+      </w:r>
+      <w:r>
+        <w:t>e и Episode_Title исключены из предикторов; они не становятся признаками скрытого запоминания. Временное разбиение невозможно обосновать по названию дня недели без календарной даты.</w:t>
       </w:r>
     </w:p>
     <w:p>
@@ -2186,10 +2264,10 @@
         <w:spacing w:before="120" w:after="60"/>
       </w:pPr>
       <w:r>
-        <w:t xml:space="preserve">Таблица 3 – </w:t>
-      </w:r>
-      <w:r>
-        <w:t>Общие части для всех моделей</w:t>
+        <w:t xml:space="preserve">Таблица 3 – Общие части для всех </w:t>
+      </w:r>
+      <w:r>
+        <w:t>моделей</w:t>
       </w:r>
     </w:p>
     <w:tbl>
@@ -2436,13 +2514,14 @@
       </w:r>
       <w:r>
         <w:br/>
-      </w:r>
-      <w:r>
         <w:t xml:space="preserve">    random_state=42).split(data, groups=data.Podcast_Name))</w:t>
       </w:r>
       <w:r>
         <w:br/>
-        <w:t># Второй групповой split отделяет valid от train_valid</w:t>
+        <w:t xml:space="preserve"># Второй групповой split отделяет valid от </w:t>
+      </w:r>
+      <w:r>
+        <w:t>train_valid</w:t>
       </w:r>
       <w:r>
         <w:br/>
@@ -2471,7 +2550,7 @@
           <w:noProof/>
         </w:rPr>
         <w:drawing>
-          <wp:inline distT="0" distB="0" distL="0" distR="0" wp14:anchorId="38508CF3" wp14:editId="053C157B">
+          <wp:inline distT="0" distB="0" distL="0" distR="0" wp14:anchorId="6E3F35C0" wp14:editId="09FDE6A9">
             <wp:extent cx="5940000" cy="2376000"/>
             <wp:effectExtent l="0" t="0" r="0" b="0"/>
             <wp:docPr id="298370852" name="Picture 298370852"/>
@@ -2514,17 +2593,14 @@
         <w:spacing w:before="60" w:after="120"/>
       </w:pPr>
       <w:r>
-        <w:t>Рисунок 1 – Распределение цели tr</w:t>
-      </w:r>
-      <w:r>
-        <w:t>ain и объёмы частей</w:t>
+        <w:t>Рисунок 1 – Распределение цели train и объёмы частей</w:t>
       </w:r>
     </w:p>
     <w:p>
       <w:pPr>
         <w:pStyle w:val="1"/>
       </w:pPr>
-      <w:bookmarkStart w:id="3" w:name="_Toc243867945"/>
+      <w:bookmarkStart w:id="3" w:name="_Toc243869333"/>
       <w:r>
         <w:t>4 Бэггинг и бустинг</w:t>
       </w:r>
@@ -2535,10 +2611,10 @@
         <w:pStyle w:val="ReportBody"/>
       </w:pPr>
       <w:r>
-        <w:t>Общая предобработка: медианное заполнение четырёх числовых признаков и OneHotEncoder(handle_unknown=ignore) для четырёх категориальных. Подготовка и регрессор объединены в Pipeline. Все стадии fit вызываются только н</w:t>
-      </w:r>
-      <w:r>
-        <w:t>а train; valid определяет параметры, test не используется при выборе.</w:t>
+        <w:t>Общая предобработка: медианное заполнение четырёх числовых приз</w:t>
+      </w:r>
+      <w:r>
+        <w:t>наков и OneHotEncoder(handle_unknown=ignore) для четырёх категориальных. Подготовка и регрессор объединены в Pipeline. Все стадии fit вызываются только на train; valid определяет параметры, test не используется при выборе.</w:t>
       </w:r>
     </w:p>
     <w:p>
@@ -2546,10 +2622,13 @@
         <w:pStyle w:val="ReportBody"/>
       </w:pPr>
       <w:r>
-        <w:t>BaggingRegressor усредняет независимые DecisionTreeRegressor, обученные на bootstrap-выборках объёма 80% train. Сравниваются 50 деревьев глубины 8 и 80 деревьев глубины 12, min_samples_l</w:t>
-      </w:r>
-      <w:r>
-        <w:t>eaf=5, n_jobs=2. HistGradientBoostingRegressor последовательно уточняет прогноз; сравниваются 100 итераций, learning_rate=0,05, 15 листьев и 200 итераций, learning_rate=0,08, 31 лист. l2_regularization=1, early_stopping=False, random_state=42.</w:t>
+        <w:t>BaggingRegressor усредняет незави</w:t>
+      </w:r>
+      <w:r>
+        <w:t>симые DecisionTreeRegressor, обученные на bootstrap-выборках объёма 80% train. Сравниваются 50 деревьев глубины 8 и 80 деревьев глубины 12, min_samples_leaf=5, n_jobs=2. HistGradientBoostingRegressor последовательно уточняет прогноз; сравниваются 100 итера</w:t>
+      </w:r>
+      <w:r>
+        <w:t>ций, learning_rate=0,05, 15 листьев и 200 итераций, learning_rate=0,08, 31 лист. l2_regularization=1, early_stopping=False, random_state=42.</w:t>
       </w:r>
     </w:p>
     <w:p>
@@ -2557,13 +2636,10 @@
         <w:pStyle w:val="ReportBody"/>
       </w:pPr>
       <w:r>
-        <w:t>Выбран CPU-в</w:t>
-      </w:r>
-      <w:r>
-        <w:t>ариант градиентного бустинга для табличной регрессии. Пример CatBoost на GPU в теоретической части иллюстрирует другую конфигурацию; практическое задание требует бэггинг и бустинг на одних данных, не предписывая единственную библиотеку. Итоговые показатели</w:t>
-      </w:r>
-      <w:r>
-        <w:t xml:space="preserve"> зависят от выбранных ограничений моделей.</w:t>
+        <w:t>Выбран CPU-вариант градиентного бустинга для табличной регрессии. Пример CatBoost на GPU в теоретической части иллю</w:t>
+      </w:r>
+      <w:r>
+        <w:t>стрирует другую конфигурацию; практическое задание требует бэггинг и бустинг на одних данных, не предписывая единственную библиотеку. Итоговые показатели зависят от выбранных ограничений моделей.</w:t>
       </w:r>
     </w:p>
     <w:p>
@@ -2583,7 +2659,10 @@
       </w:pPr>
       <w:r>
         <w:lastRenderedPageBreak/>
-        <w:t>Таблица 4 – Выбор по RMSE valid</w:t>
+        <w:t xml:space="preserve">Таблица 4 – Выбор по </w:t>
+      </w:r>
+      <w:r>
+        <w:t>RMSE valid</w:t>
       </w:r>
     </w:p>
     <w:tbl>
@@ -3079,17 +3158,17 @@
         <w:pStyle w:val="ReportBody"/>
       </w:pPr>
       <w:r>
-        <w:t xml:space="preserve">В каждом семействе выбрана конфигурация с минимальным RMSE valid: бэггинг из 50 деревьев глубины 8 и </w:t>
-      </w:r>
-      <w:r>
-        <w:t>бустинг из 100 итераций с learning_rate=0,05. Более сложные варианты не улучшили эту оценку. Параметры зафиксированы до итоговой проверки.</w:t>
+        <w:t xml:space="preserve">В каждом семействе выбрана конфигурация с минимальным RMSE valid: бэггинг из 50 деревьев глубины 8 и бустинг из 100 итераций с learning_rate=0,05. Более сложные варианты не улучшили эту оценку. </w:t>
+      </w:r>
+      <w:r>
+        <w:t>Параметры зафиксированы до итоговой проверки.</w:t>
       </w:r>
     </w:p>
     <w:p>
       <w:pPr>
         <w:pStyle w:val="1"/>
       </w:pPr>
-      <w:bookmarkStart w:id="4" w:name="_Toc243867946"/>
+      <w:bookmarkStart w:id="4" w:name="_Toc243869334"/>
       <w:r>
         <w:t>5 Качество на test</w:t>
       </w:r>
@@ -3187,13 +3266,7 @@
               <w:rPr>
                 <w:b/>
               </w:rPr>
-              <w:t>MAE ми</w:t>
-            </w:r>
-            <w:r>
-              <w:rPr>
-                <w:b/>
-              </w:rPr>
-              <w:t>н</w:t>
+              <w:t>MAE мин</w:t>
             </w:r>
           </w:p>
         </w:tc>
@@ -3495,10 +3568,10 @@
         <w:pStyle w:val="ReportBody"/>
       </w:pPr>
       <w:r>
-        <w:t xml:space="preserve">Бэггинг: RMSE 13,652 мин; бустинг: 13,595 мин. Разница 0,057 мин мала </w:t>
-      </w:r>
-      <w:r>
-        <w:t>относительно общей ошибки. Оба ансамбля заметно лучше среднего train и одиночного дерева на этом разбиении. Один test без повторной групповой оценки не доказывает статистически значимое превосходство семейства во всех данных.</w:t>
+        <w:t xml:space="preserve">Бэггинг: RMSE 13,652 мин; бустинг: 13,595 мин. Разница 0,057 мин мала относительно общей ошибки. Оба ансамбля заметно лучше среднего train и одиночного дерева на этом </w:t>
+      </w:r>
+      <w:r>
+        <w:t>разбиении. Один test без повторной групповой оценки не доказывает статистически значимое превосходство семейства во всех данных.</w:t>
       </w:r>
     </w:p>
     <w:p>
@@ -3507,10 +3580,7 @@
         <w:keepNext/>
       </w:pPr>
       <w:r>
-        <w:t>На рисунке 2 показан результат</w:t>
-      </w:r>
-      <w:r>
-        <w:t xml:space="preserve"> выполнения на стенде.</w:t>
+        <w:t>На рисунке 2 показан результат выполнения на стенде.</w:t>
       </w:r>
     </w:p>
     <w:p>
@@ -3525,7 +3595,7 @@
           <w:noProof/>
         </w:rPr>
         <w:drawing>
-          <wp:inline distT="0" distB="0" distL="0" distR="0" wp14:anchorId="6D10C2EF" wp14:editId="37132DF5">
+          <wp:inline distT="0" distB="0" distL="0" distR="0" wp14:anchorId="6C86A80D" wp14:editId="04E9DF95">
             <wp:extent cx="5940000" cy="1697143"/>
             <wp:effectExtent l="0" t="0" r="0" b="0"/>
             <wp:docPr id="298370853" name="Picture 298370853"/>
@@ -3575,10 +3645,13 @@
       <w:pPr>
         <w:pStyle w:val="1"/>
       </w:pPr>
-      <w:bookmarkStart w:id="5" w:name="_Toc243867947"/>
+      <w:bookmarkStart w:id="5" w:name="_Toc243869335"/>
       <w:r>
         <w:lastRenderedPageBreak/>
-        <w:t>6 Время обучения</w:t>
+        <w:t xml:space="preserve">6 Время </w:t>
+      </w:r>
+      <w:r>
+        <w:t>обучения</w:t>
       </w:r>
       <w:bookmarkEnd w:id="5"/>
     </w:p>
@@ -3587,10 +3660,10 @@
         <w:pStyle w:val="ReportBody"/>
       </w:pPr>
       <w:r>
-        <w:t>Для каждой выбранной конфигурации выполнены три повторных fit на неизменной train с тем же seed. Каждый замер включает общую предобработку и модель, н</w:t>
-      </w:r>
-      <w:r>
-        <w:t>о исключает чтение CSV, подбор и построение графиков. Медиана уменьшает влияние одиночного всплеска. Все замеры относятся к двум CPU одного стенда, без GPU и сравнения между разными машинами.</w:t>
+        <w:t>Для каждой выбранной конфигурации выполнены три повторных fit на неизменной train с тем же seed. Каждый замер включает общую предобработку и модель, но исключает чтение CSV, подбор и построение графиков. Медиана уменьшает влияние одиночного всплес</w:t>
+      </w:r>
+      <w:r>
+        <w:t>ка. Все замеры относятся к двум CPU одного стенда, без GPU и сравнения между разными машинами.</w:t>
       </w:r>
     </w:p>
     <w:p>
@@ -3609,10 +3682,7 @@
         <w:spacing w:before="120" w:after="60"/>
       </w:pPr>
       <w:r>
-        <w:t>Таблица 6 – Повторы обучения и</w:t>
-      </w:r>
-      <w:r>
-        <w:t xml:space="preserve"> прогноз test</w:t>
+        <w:t>Таблица 6 – Повторы обучения и прогноз test</w:t>
       </w:r>
     </w:p>
     <w:tbl>
@@ -3970,7 +4040,7 @@
           <w:noProof/>
         </w:rPr>
         <w:drawing>
-          <wp:inline distT="0" distB="0" distL="0" distR="0" wp14:anchorId="75D6CF77" wp14:editId="4CE202AA">
+          <wp:inline distT="0" distB="0" distL="0" distR="0" wp14:anchorId="1B32F720" wp14:editId="0D3F4F9C">
             <wp:extent cx="4680000" cy="2674286"/>
             <wp:effectExtent l="0" t="0" r="0" b="0"/>
             <wp:docPr id="298370854" name="Picture 298370854"/>
@@ -4021,22 +4091,19 @@
         <w:pStyle w:val="ReportBody"/>
       </w:pPr>
       <w:r>
-        <w:t xml:space="preserve">В </w:t>
-      </w:r>
-      <w:r>
-        <w:t>данной серии бустинг обучался быстрее примерно в 4,15 раза. Это сравнение конкретных конфигураций: число и глубина деревьев, гистограммная реализация и параллелизм влияют на стоимость. Короткая серия с фиксированным порядком не является универсальным рейти</w:t>
-      </w:r>
-      <w:r>
-        <w:t>нгом алгоритмов.</w:t>
+        <w:t xml:space="preserve">В данной серии бустинг обучался быстрее примерно в 4,15 раза. Это сравнение </w:t>
+      </w:r>
+      <w:r>
+        <w:t>конкретных конфигураций: число и глубина деревьев, гистограммная реализация и параллелизм влияют на стоимость. Короткая серия с фиксированным порядком не является универсальным рейтингом алгоритмов.</w:t>
       </w:r>
     </w:p>
     <w:p>
       <w:pPr>
         <w:pStyle w:val="1"/>
       </w:pPr>
-      <w:bookmarkStart w:id="6" w:name="_Toc243867948"/>
-      <w:r>
-        <w:t>7 Сохранение и выводы</w:t>
+      <w:bookmarkStart w:id="6" w:name="_Toc243869336"/>
+      <w:r>
+        <w:t>7 Полный запуск в Google Colab</w:t>
       </w:r>
       <w:bookmarkEnd w:id="6"/>
     </w:p>
@@ -4045,14 +4112,17 @@
         <w:pStyle w:val="ReportBody"/>
       </w:pPr>
       <w:r>
-        <w:t xml:space="preserve">Обе выбранные Pipeline сохранены через joblib вместе с медианами и словарями категорий. Повторное чтение моделей воспроизвело прогноз с </w:t>
+        <w:t>В Google Colab выполнен Ru</w:t>
+      </w:r>
+      <w:r>
+        <w:t xml:space="preserve">n All в новой среде: пять расчётных ячеек получили счётчики 1–5 и завершились без ошибок. Шестая вспомогательная </w:t>
       </w:r>
       <w:r>
         <w:lastRenderedPageBreak/>
-        <w:t>абсолютным допуском 10⁻¹². Экспортированы параметры valid, все test-прогнозы, таб</w:t>
-      </w:r>
-      <w:r>
-        <w:t>лицы метрик, групповой состав частей и временные повторы. Исходный CSV и бинарные модели остаются локально и в VM; исходники и доказательства запуска доступны в репозитории.</w:t>
+        <w:t>ячейка проверила источник и экспортировала результаты; экспорт зафиксирован 26.10.2026 00:56:03 МСК. SHA256 каждой из пяти расчётных ячеек совп</w:t>
+      </w:r>
+      <w:r>
+        <w:t>ал с локальным блокнотом, SHA256 исходного CSV совпал с манифестом.</w:t>
       </w:r>
     </w:p>
     <w:p>
@@ -4060,24 +4130,836 @@
         <w:pStyle w:val="ReportBody"/>
       </w:pPr>
       <w:r>
-        <w:t>Бэггинг уменьшил ошибку одиночного дерева усреднением независимых моделей. Бустинг</w:t>
-      </w:r>
-      <w:r>
-        <w:t xml:space="preserve"> достиг близкого и немного меньшего RMSE с меньшим временем в этой серии. Достоверность сравнения обеспечивают общие данные, групповое разбиение и обучение подготовки только на train. Ограничения: неоднозначные идентификаторы эпизодов, пропуски, неизвестны</w:t>
-      </w:r>
-      <w:r>
-        <w:t>й временной паспорт части метаданных и отсутствие календарной даты для временной проверки.</w:t>
-      </w:r>
-    </w:p>
+        <w:t>Результаты приведены в таблице 7.</w:t>
+      </w:r>
+    </w:p>
+    <w:p>
+      <w:pPr>
+        <w:pStyle w:val="ReportTableCaption"/>
+        <w:keepNext/>
+        <w:keepLines/>
+        <w:spacing w:before="120" w:after="60"/>
+      </w:pPr>
+      <w:r>
+        <w:t>Таблица 7 – Фактическая облачная среда</w:t>
+      </w:r>
+    </w:p>
+    <w:tbl>
+      <w:tblPr>
+        <w:tblStyle w:val="a3"/>
+        <w:tblW w:w="0" w:type="auto"/>
+        <w:jc w:val="center"/>
+        <w:tblLayout w:type="fixed"/>
+        <w:tblLook w:val="04A0" w:firstRow="1" w:lastRow="0" w:firstColumn="1" w:lastColumn="0" w:noHBand="0" w:noVBand="1"/>
+      </w:tblPr>
+      <w:tblGrid>
+        <w:gridCol w:w="3005"/>
+        <w:gridCol w:w="6350"/>
+      </w:tblGrid>
+      <w:tr>
+        <w:trPr>
+          <w:cantSplit/>
+          <w:tblHeader/>
+          <w:jc w:val="center"/>
+        </w:trPr>
+        <w:tc>
+          <w:tcPr>
+            <w:tcW w:w="3005" w:type="dxa"/>
+            <w:vAlign w:val="center"/>
+          </w:tcPr>
+          <w:p>
+            <w:pPr>
+              <w:pStyle w:val="ReportTable"/>
+              <w:keepNext/>
+              <w:jc w:val="center"/>
+            </w:pPr>
+            <w:r>
+              <w:rPr>
+                <w:b/>
+              </w:rPr>
+              <w:t>Параметр</w:t>
+            </w:r>
+          </w:p>
+        </w:tc>
+        <w:tc>
+          <w:tcPr>
+            <w:tcW w:w="6350" w:type="dxa"/>
+            <w:vAlign w:val="center"/>
+          </w:tcPr>
+          <w:p>
+            <w:pPr>
+              <w:pStyle w:val="ReportTable"/>
+              <w:keepNext/>
+              <w:jc w:val="center"/>
+            </w:pPr>
+            <w:r>
+              <w:rPr>
+                <w:b/>
+              </w:rPr>
+              <w:t>Значение</w:t>
+            </w:r>
+          </w:p>
+        </w:tc>
+      </w:tr>
+      <w:tr>
+        <w:trPr>
+          <w:cantSplit/>
+          <w:jc w:val="center"/>
+        </w:trPr>
+        <w:tc>
+          <w:tcPr>
+            <w:tcW w:w="3005" w:type="dxa"/>
+            <w:vAlign w:val="center"/>
+          </w:tcPr>
+          <w:p>
+            <w:pPr>
+              <w:pStyle w:val="ReportTable"/>
+            </w:pPr>
+            <w:r>
+              <w:t>Платформа</w:t>
+            </w:r>
+          </w:p>
+        </w:tc>
+        <w:tc>
+          <w:tcPr>
+            <w:tcW w:w="6350" w:type="dxa"/>
+            <w:vAlign w:val="center"/>
+          </w:tcPr>
+          <w:p>
+            <w:pPr>
+              <w:pStyle w:val="ReportTable"/>
+            </w:pPr>
+            <w:r>
+              <w:t>Google Colab CPU, новая среда Google Compute Engine</w:t>
+            </w:r>
+          </w:p>
+        </w:tc>
+      </w:tr>
+      <w:tr>
+        <w:trPr>
+          <w:cantSplit/>
+          <w:jc w:val="center"/>
+        </w:trPr>
+        <w:tc>
+          <w:tcPr>
+            <w:tcW w:w="3005" w:type="dxa"/>
+            <w:vAlign w:val="center"/>
+          </w:tcPr>
+          <w:p>
+            <w:pPr>
+              <w:pStyle w:val="ReportTable"/>
+            </w:pPr>
+            <w:r>
+              <w:t>Python / scikit-learn</w:t>
+            </w:r>
+          </w:p>
+        </w:tc>
+        <w:tc>
+          <w:tcPr>
+            <w:tcW w:w="6350" w:type="dxa"/>
+            <w:vAlign w:val="center"/>
+          </w:tcPr>
+          <w:p>
+            <w:pPr>
+              <w:pStyle w:val="ReportTable"/>
+            </w:pPr>
+            <w:r>
+              <w:t>3.13.16 / 1.6.1</w:t>
+            </w:r>
+          </w:p>
+        </w:tc>
+      </w:tr>
+      <w:tr>
+        <w:trPr>
+          <w:cantSplit/>
+          <w:jc w:val="center"/>
+        </w:trPr>
+        <w:tc>
+          <w:tcPr>
+            <w:tcW w:w="3005" w:type="dxa"/>
+            <w:vAlign w:val="center"/>
+          </w:tcPr>
+          <w:p>
+            <w:pPr>
+              <w:pStyle w:val="ReportTable"/>
+            </w:pPr>
+            <w:r>
+              <w:t>NumPy / pandas</w:t>
+            </w:r>
+          </w:p>
+        </w:tc>
+        <w:tc>
+          <w:tcPr>
+            <w:tcW w:w="6350" w:type="dxa"/>
+            <w:vAlign w:val="center"/>
+          </w:tcPr>
+          <w:p>
+            <w:pPr>
+              <w:pStyle w:val="ReportTable"/>
+            </w:pPr>
+            <w:r>
+              <w:t>2.1.3 / 2.2.3</w:t>
+            </w:r>
+          </w:p>
+        </w:tc>
+      </w:tr>
+      <w:tr>
+        <w:trPr>
+          <w:cantSplit/>
+          <w:jc w:val="center"/>
+        </w:trPr>
+        <w:tc>
+          <w:tcPr>
+            <w:tcW w:w="3005" w:type="dxa"/>
+            <w:vAlign w:val="center"/>
+          </w:tcPr>
+          <w:p>
+            <w:pPr>
+              <w:pStyle w:val="ReportTable"/>
+            </w:pPr>
+            <w:r>
+              <w:t>Matplotlib</w:t>
+            </w:r>
+          </w:p>
+        </w:tc>
+        <w:tc>
+          <w:tcPr>
+            <w:tcW w:w="6350" w:type="dxa"/>
+            <w:vAlign w:val="center"/>
+          </w:tcPr>
+          <w:p>
+            <w:pPr>
+              <w:pStyle w:val="ReportTable"/>
+              <w:jc w:val="center"/>
+            </w:pPr>
+            <w:r>
+              <w:t>3.10.0</w:t>
+            </w:r>
+          </w:p>
+        </w:tc>
+      </w:tr>
+      <w:tr>
+        <w:trPr>
+          <w:cantSplit/>
+          <w:jc w:val="center"/>
+        </w:trPr>
+        <w:tc>
+          <w:tcPr>
+            <w:tcW w:w="3005" w:type="dxa"/>
+            <w:vAlign w:val="center"/>
+          </w:tcPr>
+          <w:p>
+            <w:pPr>
+              <w:pStyle w:val="ReportTable"/>
+            </w:pPr>
+            <w:r>
+              <w:t>CPU</w:t>
+            </w:r>
+          </w:p>
+        </w:tc>
+        <w:tc>
+          <w:tcPr>
+            <w:tcW w:w="6350" w:type="dxa"/>
+            <w:vAlign w:val="center"/>
+          </w:tcPr>
+          <w:p>
+            <w:pPr>
+              <w:pStyle w:val="ReportTable"/>
+            </w:pPr>
+            <w:r>
+              <w:t>Intel(R) Xeon(R) CPU @ 2.20GHz; 2 vCPU</w:t>
+            </w:r>
+          </w:p>
+        </w:tc>
+      </w:tr>
+      <w:tr>
+        <w:trPr>
+          <w:cantSplit/>
+          <w:jc w:val="center"/>
+        </w:trPr>
+        <w:tc>
+          <w:tcPr>
+            <w:tcW w:w="3005" w:type="dxa"/>
+            <w:vAlign w:val="center"/>
+          </w:tcPr>
+          <w:p>
+            <w:pPr>
+              <w:pStyle w:val="ReportTable"/>
+            </w:pPr>
+            <w:r>
+              <w:t>Память</w:t>
+            </w:r>
+          </w:p>
+        </w:tc>
+        <w:tc>
+          <w:tcPr>
+            <w:tcW w:w="6350" w:type="dxa"/>
+            <w:vAlign w:val="center"/>
+          </w:tcPr>
+          <w:p>
+            <w:pPr>
+              <w:pStyle w:val="ReportTable"/>
+            </w:pPr>
+            <w:r>
+              <w:t>12,67 ГиБ</w:t>
+            </w:r>
+          </w:p>
+        </w:tc>
+      </w:tr>
+    </w:tbl>
     <w:p>
       <w:pPr>
         <w:pStyle w:val="ReportBody"/>
       </w:pPr>
       <w:r>
-        <w:t>Отдельный verify_results.py восстановил 44 868 оставшихся строк, проверил непересечение 28/10/10 подкастов, совпадение цели test с исходником, медианы train и все че</w:t>
-      </w:r>
-      <w:r>
-        <w:t>тыре набора регрессионных метрик. Уникальность набора во всей учебной группе проверяется по её реестру; в личном комплекте этот набор используется только для ПР7.</w:t>
+        <w:t>Результаты приведены в таблице 8.</w:t>
+      </w:r>
+    </w:p>
+    <w:p>
+      <w:pPr>
+        <w:pStyle w:val="ReportTableCaption"/>
+        <w:keepNext/>
+        <w:keepLines/>
+        <w:spacing w:before="120" w:after="60"/>
+      </w:pPr>
+      <w:r>
+        <w:t>Таблица 8 – Облачная проверка на том же test</w:t>
+      </w:r>
+    </w:p>
+    <w:tbl>
+      <w:tblPr>
+        <w:tblStyle w:val="a3"/>
+        <w:tblW w:w="0" w:type="auto"/>
+        <w:jc w:val="center"/>
+        <w:tblLayout w:type="fixed"/>
+        <w:tblLook w:val="04A0" w:firstRow="1" w:lastRow="0" w:firstColumn="1" w:lastColumn="0" w:noHBand="0" w:noVBand="1"/>
+      </w:tblPr>
+      <w:tblGrid>
+        <w:gridCol w:w="2268"/>
+        <w:gridCol w:w="1757"/>
+        <w:gridCol w:w="1757"/>
+        <w:gridCol w:w="1701"/>
+        <w:gridCol w:w="1871"/>
+      </w:tblGrid>
+      <w:tr>
+        <w:trPr>
+          <w:cantSplit/>
+          <w:tblHeader/>
+          <w:jc w:val="center"/>
+        </w:trPr>
+        <w:tc>
+          <w:tcPr>
+            <w:tcW w:w="2268" w:type="dxa"/>
+            <w:vAlign w:val="center"/>
+          </w:tcPr>
+          <w:p>
+            <w:pPr>
+              <w:pStyle w:val="ReportTable"/>
+              <w:keepNext/>
+              <w:jc w:val="center"/>
+            </w:pPr>
+            <w:r>
+              <w:rPr>
+                <w:b/>
+              </w:rPr>
+              <w:t>Модель</w:t>
+            </w:r>
+          </w:p>
+        </w:tc>
+        <w:tc>
+          <w:tcPr>
+            <w:tcW w:w="1757" w:type="dxa"/>
+            <w:vAlign w:val="center"/>
+          </w:tcPr>
+          <w:p>
+            <w:pPr>
+              <w:pStyle w:val="ReportTable"/>
+              <w:keepNext/>
+              <w:jc w:val="center"/>
+            </w:pPr>
+            <w:r>
+              <w:rPr>
+                <w:b/>
+              </w:rPr>
+              <w:t>RMSE мин</w:t>
+            </w:r>
+          </w:p>
+        </w:tc>
+        <w:tc>
+          <w:tcPr>
+            <w:tcW w:w="1757" w:type="dxa"/>
+            <w:vAlign w:val="center"/>
+          </w:tcPr>
+          <w:p>
+            <w:pPr>
+              <w:pStyle w:val="ReportTable"/>
+              <w:keepNext/>
+              <w:jc w:val="center"/>
+            </w:pPr>
+            <w:r>
+              <w:rPr>
+                <w:b/>
+              </w:rPr>
+              <w:t>MAE мин</w:t>
+            </w:r>
+          </w:p>
+        </w:tc>
+        <w:tc>
+          <w:tcPr>
+            <w:tcW w:w="1701" w:type="dxa"/>
+            <w:vAlign w:val="center"/>
+          </w:tcPr>
+          <w:p>
+            <w:pPr>
+              <w:pStyle w:val="ReportTable"/>
+              <w:keepNext/>
+              <w:jc w:val="center"/>
+            </w:pPr>
+            <w:r>
+              <w:rPr>
+                <w:b/>
+              </w:rPr>
+              <w:t>R²</w:t>
+            </w:r>
+          </w:p>
+        </w:tc>
+        <w:tc>
+          <w:tcPr>
+            <w:tcW w:w="1871" w:type="dxa"/>
+            <w:vAlign w:val="center"/>
+          </w:tcPr>
+          <w:p>
+            <w:pPr>
+              <w:pStyle w:val="ReportTable"/>
+              <w:keepNext/>
+              <w:jc w:val="center"/>
+            </w:pPr>
+            <w:r>
+              <w:rPr>
+                <w:b/>
+              </w:rPr>
+              <w:t>Fit с</w:t>
+            </w:r>
+          </w:p>
+        </w:tc>
+      </w:tr>
+      <w:tr>
+        <w:trPr>
+          <w:cantSplit/>
+          <w:jc w:val="center"/>
+        </w:trPr>
+        <w:tc>
+          <w:tcPr>
+            <w:tcW w:w="2268" w:type="dxa"/>
+            <w:vAlign w:val="center"/>
+          </w:tcPr>
+          <w:p>
+            <w:pPr>
+              <w:pStyle w:val="ReportTable"/>
+              <w:keepNext/>
+            </w:pPr>
+            <w:r>
+              <w:t>Бэггинг</w:t>
+            </w:r>
+          </w:p>
+        </w:tc>
+        <w:tc>
+          <w:tcPr>
+            <w:tcW w:w="1757" w:type="dxa"/>
+            <w:vAlign w:val="center"/>
+          </w:tcPr>
+          <w:p>
+            <w:pPr>
+              <w:pStyle w:val="ReportTable"/>
+              <w:keepNext/>
+              <w:jc w:val="center"/>
+            </w:pPr>
+            <w:r>
+              <w:t>13,652</w:t>
+            </w:r>
+          </w:p>
+        </w:tc>
+        <w:tc>
+          <w:tcPr>
+            <w:tcW w:w="1757" w:type="dxa"/>
+            <w:vAlign w:val="center"/>
+          </w:tcPr>
+          <w:p>
+            <w:pPr>
+              <w:pStyle w:val="ReportTable"/>
+              <w:keepNext/>
+              <w:jc w:val="center"/>
+            </w:pPr>
+            <w:r>
+              <w:t>10,171</w:t>
+            </w:r>
+          </w:p>
+        </w:tc>
+        <w:tc>
+          <w:tcPr>
+            <w:tcW w:w="1701" w:type="dxa"/>
+            <w:vAlign w:val="center"/>
+          </w:tcPr>
+          <w:p>
+            <w:pPr>
+              <w:pStyle w:val="ReportTable"/>
+              <w:keepNext/>
+              <w:jc w:val="center"/>
+            </w:pPr>
+            <w:r>
+              <w:t>0,7481</w:t>
+            </w:r>
+          </w:p>
+        </w:tc>
+        <w:tc>
+          <w:tcPr>
+            <w:tcW w:w="1871" w:type="dxa"/>
+            <w:vAlign w:val="center"/>
+          </w:tcPr>
+          <w:p>
+            <w:pPr>
+              <w:pStyle w:val="ReportTable"/>
+              <w:keepNext/>
+              <w:jc w:val="center"/>
+            </w:pPr>
+            <w:r>
+              <w:t>4,1493</w:t>
+            </w:r>
+          </w:p>
+        </w:tc>
+      </w:tr>
+      <w:tr>
+        <w:trPr>
+          <w:cantSplit/>
+          <w:jc w:val="center"/>
+        </w:trPr>
+        <w:tc>
+          <w:tcPr>
+            <w:tcW w:w="2268" w:type="dxa"/>
+            <w:vAlign w:val="center"/>
+          </w:tcPr>
+          <w:p>
+            <w:pPr>
+              <w:pStyle w:val="ReportTable"/>
+              <w:keepNext/>
+            </w:pPr>
+            <w:r>
+              <w:t>Бустинг</w:t>
+            </w:r>
+          </w:p>
+        </w:tc>
+        <w:tc>
+          <w:tcPr>
+            <w:tcW w:w="1757" w:type="dxa"/>
+            <w:vAlign w:val="center"/>
+          </w:tcPr>
+          <w:p>
+            <w:pPr>
+              <w:pStyle w:val="ReportTable"/>
+              <w:keepNext/>
+              <w:jc w:val="center"/>
+            </w:pPr>
+            <w:r>
+              <w:t>13,595</w:t>
+            </w:r>
+          </w:p>
+        </w:tc>
+        <w:tc>
+          <w:tcPr>
+            <w:tcW w:w="1757" w:type="dxa"/>
+            <w:vAlign w:val="center"/>
+          </w:tcPr>
+          <w:p>
+            <w:pPr>
+              <w:pStyle w:val="ReportTable"/>
+              <w:keepNext/>
+              <w:jc w:val="center"/>
+            </w:pPr>
+            <w:r>
+              <w:t>10,136</w:t>
+            </w:r>
+          </w:p>
+        </w:tc>
+        <w:tc>
+          <w:tcPr>
+            <w:tcW w:w="1701" w:type="dxa"/>
+            <w:vAlign w:val="center"/>
+          </w:tcPr>
+          <w:p>
+            <w:pPr>
+              <w:pStyle w:val="ReportTable"/>
+              <w:keepNext/>
+              <w:jc w:val="center"/>
+            </w:pPr>
+            <w:r>
+              <w:t>0,7502</w:t>
+            </w:r>
+          </w:p>
+        </w:tc>
+        <w:tc>
+          <w:tcPr>
+            <w:tcW w:w="1871" w:type="dxa"/>
+            <w:vAlign w:val="center"/>
+          </w:tcPr>
+          <w:p>
+            <w:pPr>
+              <w:pStyle w:val="ReportTable"/>
+              <w:keepNext/>
+              <w:jc w:val="center"/>
+            </w:pPr>
+            <w:r>
+              <w:t>0,8522</w:t>
+            </w:r>
+          </w:p>
+        </w:tc>
+      </w:tr>
+      <w:tr>
+        <w:trPr>
+          <w:cantSplit/>
+          <w:jc w:val="center"/>
+        </w:trPr>
+        <w:tc>
+          <w:tcPr>
+            <w:tcW w:w="2268" w:type="dxa"/>
+            <w:vAlign w:val="center"/>
+          </w:tcPr>
+          <w:p>
+            <w:pPr>
+              <w:pStyle w:val="ReportTable"/>
+              <w:keepNext/>
+            </w:pPr>
+            <w:r>
+              <w:t>Среднее</w:t>
+            </w:r>
+          </w:p>
+        </w:tc>
+        <w:tc>
+          <w:tcPr>
+            <w:tcW w:w="1757" w:type="dxa"/>
+            <w:vAlign w:val="center"/>
+          </w:tcPr>
+          <w:p>
+            <w:pPr>
+              <w:pStyle w:val="ReportTable"/>
+              <w:keepNext/>
+              <w:jc w:val="center"/>
+            </w:pPr>
+            <w:r>
+              <w:t>27,218</w:t>
+            </w:r>
+          </w:p>
+        </w:tc>
+        <w:tc>
+          <w:tcPr>
+            <w:tcW w:w="1757" w:type="dxa"/>
+            <w:vAlign w:val="center"/>
+          </w:tcPr>
+          <w:p>
+            <w:pPr>
+              <w:pStyle w:val="ReportTable"/>
+              <w:keepNext/>
+              <w:jc w:val="center"/>
+            </w:pPr>
+            <w:r>
+              <w:t>22,733</w:t>
+            </w:r>
+          </w:p>
+        </w:tc>
+        <w:tc>
+          <w:tcPr>
+            <w:tcW w:w="1701" w:type="dxa"/>
+            <w:vAlign w:val="center"/>
+          </w:tcPr>
+          <w:p>
+            <w:pPr>
+              <w:pStyle w:val="ReportTable"/>
+              <w:keepNext/>
+              <w:jc w:val="center"/>
+            </w:pPr>
+            <w:r>
+              <w:t>-0,0012</w:t>
+            </w:r>
+          </w:p>
+        </w:tc>
+        <w:tc>
+          <w:tcPr>
+            <w:tcW w:w="1871" w:type="dxa"/>
+            <w:vAlign w:val="center"/>
+          </w:tcPr>
+          <w:p>
+            <w:pPr>
+              <w:pStyle w:val="ReportTable"/>
+              <w:keepNext/>
+              <w:jc w:val="center"/>
+            </w:pPr>
+            <w:r>
+              <w:t>0,0487</w:t>
+            </w:r>
+          </w:p>
+        </w:tc>
+      </w:tr>
+      <w:tr>
+        <w:trPr>
+          <w:cantSplit/>
+          <w:jc w:val="center"/>
+        </w:trPr>
+        <w:tc>
+          <w:tcPr>
+            <w:tcW w:w="2268" w:type="dxa"/>
+            <w:vAlign w:val="center"/>
+          </w:tcPr>
+          <w:p>
+            <w:pPr>
+              <w:pStyle w:val="ReportTable"/>
+            </w:pPr>
+            <w:r>
+              <w:t>Дерево</w:t>
+            </w:r>
+          </w:p>
+        </w:tc>
+        <w:tc>
+          <w:tcPr>
+            <w:tcW w:w="1757" w:type="dxa"/>
+            <w:vAlign w:val="center"/>
+          </w:tcPr>
+          <w:p>
+            <w:pPr>
+              <w:pStyle w:val="ReportTable"/>
+              <w:jc w:val="center"/>
+            </w:pPr>
+            <w:r>
+              <w:t>15,037</w:t>
+            </w:r>
+          </w:p>
+        </w:tc>
+        <w:tc>
+          <w:tcPr>
+            <w:tcW w:w="1757" w:type="dxa"/>
+            <w:vAlign w:val="center"/>
+          </w:tcPr>
+          <w:p>
+            <w:pPr>
+              <w:pStyle w:val="ReportTable"/>
+              <w:jc w:val="center"/>
+            </w:pPr>
+            <w:r>
+              <w:t>11,169</w:t>
+            </w:r>
+          </w:p>
+        </w:tc>
+        <w:tc>
+          <w:tcPr>
+            <w:tcW w:w="1701" w:type="dxa"/>
+            <w:vAlign w:val="center"/>
+          </w:tcPr>
+          <w:p>
+            <w:pPr>
+              <w:pStyle w:val="ReportTable"/>
+              <w:jc w:val="center"/>
+            </w:pPr>
+            <w:r>
+              <w:t>0,6944</w:t>
+            </w:r>
+          </w:p>
+        </w:tc>
+        <w:tc>
+          <w:tcPr>
+            <w:tcW w:w="1871" w:type="dxa"/>
+            <w:vAlign w:val="center"/>
+          </w:tcPr>
+          <w:p>
+            <w:pPr>
+              <w:pStyle w:val="ReportTable"/>
+              <w:jc w:val="center"/>
+            </w:pPr>
+            <w:r>
+              <w:t>0,2535</w:t>
+            </w:r>
+          </w:p>
+        </w:tc>
+      </w:tr>
+    </w:tbl>
+    <w:p>
+      <w:pPr>
+        <w:pStyle w:val="ReportBody"/>
+      </w:pPr>
+      <w:r>
+        <w:t xml:space="preserve">В столбце Fit для ансамблей указана медиана трёх повторов, для базовых моделей — один fit. Облачные повторы </w:t>
+      </w:r>
+      <w:r>
+        <w:t>бэггинга: 5,2154, 4,1493, 3,1878 с; бустинга: 0,8414, 0,8522, 0,8589 с. Внутри облачной серии бустинг быстрее примерно в 4,87 раза. Различия абсолютных времён с VM отражают оборудование, нагрузку и версии среды.</w:t>
+      </w:r>
+    </w:p>
+    <w:p>
+      <w:pPr>
+        <w:pStyle w:val="ReportBody"/>
+      </w:pPr>
+      <w:r>
+        <w:t xml:space="preserve">По сохранённым CSV отдельно пересчитаны все </w:t>
+      </w:r>
+      <w:r>
+        <w:t>четыре набора test-метрик, проверены части и медианы train. Максимальная разность прогнозов Colab и VM равна 0,000000000000. Параметры и выбранные модели совпали; независимая проверка не заменяла облачные числа локальными.</w:t>
+      </w:r>
+    </w:p>
+    <w:p>
+      <w:pPr>
+        <w:pStyle w:val="ReportBody"/>
+      </w:pPr>
+      <w:r>
+        <w:t>В results/pr7/colab сохранены обл</w:t>
+      </w:r>
+      <w:r>
+        <w:t>ачные JSON, CSV и PNG, протокол, снимок интерфейса run_all.png и origin.json со ссылкой на выполненный блокнот Google. Подтверждение содержит состояние passed, google_colab=true, номера расчётных ячеек, версии и сведения CPU. Блокнот сохранён на Google Дис</w:t>
+      </w:r>
+      <w:r>
+        <w:t>ке пользователя без изменения доступа.</w:t>
+      </w:r>
+    </w:p>
+    <w:p>
+      <w:pPr>
+        <w:pStyle w:val="1"/>
+      </w:pPr>
+      <w:bookmarkStart w:id="7" w:name="_Toc243869337"/>
+      <w:r>
+        <w:lastRenderedPageBreak/>
+        <w:t>8 Сохранение и выводы</w:t>
+      </w:r>
+      <w:bookmarkEnd w:id="7"/>
+    </w:p>
+    <w:p>
+      <w:pPr>
+        <w:pStyle w:val="ReportBody"/>
+      </w:pPr>
+      <w:r>
+        <w:t xml:space="preserve">Обе выбранные Pipeline сохранены через joblib вместе с медианами и словарями категорий. Повторное чтение моделей воспроизвело прогноз с абсолютным допуском 10⁻¹². Экспортированы </w:t>
+      </w:r>
+      <w:r>
+        <w:t>параметры valid, все test-прогнозы, таблицы метрик, групповой состав частей и временные повторы. Исходный CSV и бинарные модели остаются локально и в VM; исходники и доказательства запуска доступны в репозитории.</w:t>
+      </w:r>
+    </w:p>
+    <w:p>
+      <w:pPr>
+        <w:pStyle w:val="ReportBody"/>
+      </w:pPr>
+      <w:r>
+        <w:t>Бэггинг уменьшил ошибку одиночного дерева у</w:t>
+      </w:r>
+      <w:r>
+        <w:t>среднением независимых моделей. Бустинг достиг близкого и немного меньшего RMSE с меньшим временем в этой серии. Достоверность сравнения обеспечивают общие данные, групповое разбиение и обучение подготовки только на train. Ограничения: неоднозначные иденти</w:t>
+      </w:r>
+      <w:r>
+        <w:t>фикаторы эпизодов, пропуски, неизвестный временной паспорт части метаданных и отсутствие календарной даты для временной проверки.</w:t>
+      </w:r>
+    </w:p>
+    <w:p>
+      <w:pPr>
+        <w:pStyle w:val="ReportBody"/>
+      </w:pPr>
+      <w:r>
+        <w:t>Отдельный verify_results.py восстановил 44 868 оставшихся строк, проверил непересечение 28/10/10 подкастов, совпадение цели te</w:t>
+      </w:r>
+      <w:r>
+        <w:t>st с исходником, медианы train и все четыре набора регрессионных метрик. Уникальность набора во всей учебной группе проверяется по её реестру; в личном комплекте этот набор используется только для ПР7.</w:t>
       </w:r>
     </w:p>
     <w:p>
@@ -4090,10 +4972,10 @@
       </w:r>
       <w:r>
         <w:br/>
-        <w:t>/home/albakhtin/tiabd/.venv/bin/python run_notebook.py</w:t>
-      </w:r>
-      <w:r>
-        <w:t xml:space="preserve"> 7</w:t>
+        <w:t>/home/albakhtin</w:t>
+      </w:r>
+      <w:r>
+        <w:t>/tiabd/.venv/bin/python run_notebook.py 7</w:t>
       </w:r>
       <w:r>
         <w:br/>
@@ -4103,12 +4985,14 @@
     <w:p>
       <w:pPr>
         <w:pStyle w:val="1"/>
-      </w:pPr>
-      <w:bookmarkStart w:id="7" w:name="_Toc243867949"/>
-      <w:r>
+        <w:pageBreakBefore/>
+      </w:pPr>
+      <w:bookmarkStart w:id="8" w:name="_Toc243869338"/>
+      <w:r>
+        <w:lastRenderedPageBreak/>
         <w:t>Источники</w:t>
       </w:r>
-      <w:bookmarkEnd w:id="7"/>
+      <w:bookmarkEnd w:id="8"/>
     </w:p>
     <w:p>
       <w:pPr>
@@ -4123,10 +5007,10 @@
         <w:pStyle w:val="ReportBody"/>
       </w:pPr>
       <w:r>
-        <w:t xml:space="preserve">2. Podcast Dataset.zip, podcast_dataset.csv. Предоставленный набор; SHA256 в </w:t>
-      </w:r>
-      <w:r>
-        <w:t>ML/source_manifest.json.</w:t>
+        <w:t>2. Podcast Dataset.zip, podcast_dataset.csv. Предоставленный набор; SHA25</w:t>
+      </w:r>
+      <w:r>
+        <w:t>6 в ML/source_manifest.json.</w:t>
       </w:r>
     </w:p>
     <w:p>
@@ -4142,19 +5026,18 @@
         <w:pStyle w:val="ReportBody"/>
       </w:pPr>
       <w:r>
-        <w:t>4. scikit-learn. GroupShuffleSplit. https://scikit-learn.org/stable/modules/generated/sklearn.model_selection.GroupShuffleSplit.html</w:t>
+        <w:t>4. scikit-learn. Grouped cross-validation. https://scikit-learn.org/stable/modules/cross_validation.html</w:t>
       </w:r>
     </w:p>
     <w:p>
       <w:pPr>
         <w:pStyle w:val="ReportBody"/>
       </w:pPr>
-      <w:r>
-        <w:t>5. Google</w:t>
-      </w:r>
-      <w:r>
-        <w:t xml:space="preserve"> Colaboratory. https://colab.research.google.com/</w:t>
-      </w:r>
+      <w:hyperlink r:id="rId12">
+        <w:r>
+          <w:t>5. Выполненный блокнот ПР7 в Google Colab</w:t>
+        </w:r>
+      </w:hyperlink>
     </w:p>
     <w:sectPr>
       <w:pgSz w:w="11906" w:h="16838"/>
@@ -5096,7 +5979,7 @@
     <w:autoRedefine/>
     <w:uiPriority w:val="39"/>
     <w:unhideWhenUsed/>
-    <w:rsid w:val="00152E5D"/>
+    <w:rsid w:val="00EC22C6"/>
     <w:pPr>
       <w:spacing w:after="100"/>
     </w:pPr>
@@ -5106,7 +5989,7 @@
     <w:basedOn w:val="a0"/>
     <w:uiPriority w:val="99"/>
     <w:unhideWhenUsed/>
-    <w:rsid w:val="00152E5D"/>
+    <w:rsid w:val="00EC22C6"/>
     <w:rPr>
       <w:color w:val="467886" w:themeColor="hyperlink"/>
       <w:u w:val="single"/>

</xml_diff>